<commit_message>
Observations feature, report highlight fix, ProjectForm consolidation, annotator tools, tab restructure, dashboard calendar, X-mark logo
</commit_message>
<xml_diff>
--- a/public/templates/note-visite-chantier.docx
+++ b/public/templates/note-visite-chantier.docx
@@ -85,7 +85,6 @@
                 <w:spacing w:val="6"/>
                 <w:sz w:val="28"/>
                 <w:szCs w:val="28"/>
-                <w:highlight w:val="yellow"/>
               </w:rPr>
               <w:t xml:space="preserve">{noteNumber}</w:t>
             </w:r>
@@ -316,7 +315,6 @@
               <w:spacing w:val="4"/>
               <w:sz w:val="17"/>
               <w:szCs w:val="17"/>
-              <w:highlight w:val="yellow"/>
             </w:rPr>
             <w:id w:val="1251236190"/>
             <w:placeholder>
@@ -361,7 +359,6 @@
                     <w:spacing w:val="4"/>
                     <w:sz w:val="17"/>
                     <w:szCs w:val="17"/>
-                    <w:highlight w:val="yellow"/>
                   </w:rPr>
                   <w:t xml:space="preserve">{transmittedBy}</w:t>
                 </w:r>
@@ -389,7 +386,6 @@
                 <w:caps/>
                 <w:sz w:val="17"/>
                 <w:szCs w:val="17"/>
-                <w:highlight w:val="yellow"/>
               </w:rPr>
               <w:id w:val="1006182325"/>
               <w:placeholder>
@@ -418,7 +414,6 @@
                     <w:caps/>
                     <w:sz w:val="17"/>
                     <w:szCs w:val="17"/>
-                    <w:highlight w:val="yellow"/>
                   </w:rPr>
                   <w:t xml:space="preserve">{date}</w:t>
                 </w:r>
@@ -558,7 +553,6 @@
                 <w:b/>
                 <w:sz w:val="24"/>
                 <w:szCs w:val="17"/>
-                <w:highlight w:val="yellow"/>
               </w:rPr>
               <w:t xml:space="preserve">{projectTitle}</w:t>
             </w:r>
@@ -632,7 +626,6 @@
                 <w:spacing w:val="4"/>
                 <w:sz w:val="17"/>
                 <w:szCs w:val="17"/>
-                <w:highlight w:val="yellow"/>
               </w:rPr>
               <w:t xml:space="preserve">{owner}</w:t>
             </w:r>
@@ -760,7 +753,6 @@
                 <w:spacing w:val="4"/>
                 <w:sz w:val="17"/>
                 <w:szCs w:val="17"/>
-                <w:highlight w:val="yellow"/>
               </w:rPr>
             </w:pPr>
             <w:r>
@@ -769,7 +761,6 @@
                 <w:spacing w:val="4"/>
                 <w:sz w:val="17"/>
                 <w:szCs w:val="17"/>
-                <w:highlight w:val="yellow"/>
               </w:rPr>
               <w:t xml:space="preserve">{contractorContactNameTitle}</w:t>
             </w:r>
@@ -782,7 +773,6 @@
                 <w:spacing w:val="4"/>
                 <w:sz w:val="17"/>
                 <w:szCs w:val="17"/>
-                <w:highlight w:val="yellow"/>
               </w:rPr>
             </w:pPr>
             <w:r>
@@ -791,7 +781,6 @@
                 <w:spacing w:val="4"/>
                 <w:sz w:val="17"/>
                 <w:szCs w:val="17"/>
-                <w:highlight w:val="yellow"/>
               </w:rPr>
               <w:t xml:space="preserve">{contractorCompany}</w:t>
             </w:r>
@@ -804,7 +793,6 @@
                 <w:spacing w:val="4"/>
                 <w:sz w:val="17"/>
                 <w:szCs w:val="17"/>
-                <w:highlight w:val="yellow"/>
               </w:rPr>
             </w:pPr>
             <w:r>
@@ -813,7 +801,6 @@
                 <w:spacing w:val="4"/>
                 <w:sz w:val="17"/>
                 <w:szCs w:val="17"/>
-                <w:highlight w:val="yellow"/>
               </w:rPr>
               <w:t xml:space="preserve">{contractorAddress}</w:t>
             </w:r>
@@ -826,7 +813,6 @@
                 <w:spacing w:val="4"/>
                 <w:sz w:val="17"/>
                 <w:szCs w:val="17"/>
-                <w:highlight w:val="yellow"/>
               </w:rPr>
             </w:pPr>
             <w:r>
@@ -835,7 +821,6 @@
                 <w:spacing w:val="4"/>
                 <w:sz w:val="17"/>
                 <w:szCs w:val="17"/>
-                <w:highlight w:val="yellow"/>
               </w:rPr>
               <w:t xml:space="preserve">{contractorPhone}</w:t>
             </w:r>
@@ -856,7 +841,6 @@
                 <w:spacing w:val="4"/>
                 <w:sz w:val="17"/>
                 <w:szCs w:val="17"/>
-                <w:highlight w:val="yellow"/>
               </w:rPr>
               <w:t xml:space="preserve">{contractorEmail}</w:t>
             </w:r>
@@ -905,7 +889,6 @@
                 <w:spacing w:val="4"/>
                 <w:sz w:val="17"/>
                 <w:szCs w:val="17"/>
-                <w:highlight w:val="yellow"/>
               </w:rPr>
             </w:pPr>
             <w:r>
@@ -923,7 +906,6 @@
                 <w:spacing w:val="4"/>
                 <w:sz w:val="17"/>
                 <w:szCs w:val="17"/>
-                <w:highlight w:val="yellow"/>
               </w:rPr>
               <w:t xml:space="preserve">{name}, {company}{/distribution}</w:t>
             </w:r>
@@ -937,7 +919,6 @@
                 <w:spacing w:val="4"/>
                 <w:sz w:val="17"/>
                 <w:szCs w:val="17"/>
-                <w:highlight w:val="yellow"/>
               </w:rPr>
             </w:pPr>
           </w:p>
@@ -1085,7 +1066,6 @@
                 <w:spacing w:val="4"/>
                 <w:sz w:val="17"/>
                 <w:szCs w:val="17"/>
-                <w:highlight w:val="yellow"/>
               </w:rPr>
               <w:t xml:space="preserve">{weather}</w:t>
             </w:r>
@@ -1120,7 +1100,6 @@
                 <w:spacing w:val="4"/>
                 <w:sz w:val="17"/>
                 <w:szCs w:val="17"/>
-                <w:highlight w:val="yellow"/>
               </w:rPr>
               <w:t xml:space="preserve">{time}</w:t>
             </w:r>
@@ -1146,7 +1125,6 @@
                 <w:caps/>
                 <w:sz w:val="17"/>
                 <w:szCs w:val="17"/>
-                <w:highlight w:val="yellow"/>
               </w:rPr>
               <w:id w:val="1505010447"/>
               <w:date w:fullDate="2022-01-10T00:00:00Z">
@@ -1172,7 +1150,6 @@
                     <w:caps/>
                     <w:sz w:val="17"/>
                     <w:szCs w:val="17"/>
-                    <w:highlight w:val="yellow"/>
                   </w:rPr>
                   <w:t xml:space="preserve">{date}</w:t>
                 </w:r>
@@ -1223,7 +1200,6 @@
                 <w:rFonts w:cs="Arial"/>
                 <w:b/>
                 <w:color w:val="000000"/>
-                <w:highlight w:val="yellow"/>
               </w:rPr>
               <w:t xml:space="preserve">{subject}</w:t>
             </w:r>
@@ -1333,14 +1309,12 @@
               <w:rPr>
                 <w:rFonts w:cs="Arial"/>
                 <w:spacing w:val="4"/>
-                <w:highlight w:val="yellow"/>
               </w:rPr>
             </w:pPr>
             <w:r>
               <w:rPr>
                 <w:rFonts w:cs="Arial"/>
                 <w:spacing w:val="4"/>
-                <w:highlight w:val="yellow"/>
               </w:rPr>
               <w:t xml:space="preserve">{#attendees}{name}</w:t>
             </w:r>
@@ -1372,14 +1346,12 @@
                 <w:spacing w:val="4"/>
                 <w:sz w:val="17"/>
                 <w:szCs w:val="17"/>
-                <w:highlight w:val="yellow"/>
               </w:rPr>
             </w:pPr>
             <w:r>
               <w:rPr>
                 <w:rFonts w:cs="Arial"/>
                 <w:spacing w:val="4"/>
-                <w:highlight w:val="yellow"/>
               </w:rPr>
               <w:t xml:space="preserve">{company}</w:t>
             </w:r>
@@ -1411,14 +1383,12 @@
                 <w:spacing w:val="4"/>
                 <w:sz w:val="17"/>
                 <w:szCs w:val="17"/>
-                <w:highlight w:val="yellow"/>
               </w:rPr>
             </w:pPr>
             <w:r>
               <w:rPr>
                 <w:rFonts w:cs="Arial"/>
                 <w:spacing w:val="4"/>
-                <w:highlight w:val="yellow"/>
               </w:rPr>
               <w:t xml:space="preserve">{title}</w:t>
             </w:r>
@@ -1451,7 +1421,6 @@
                 <w:spacing w:val="4"/>
                 <w:sz w:val="17"/>
                 <w:szCs w:val="17"/>
-                <w:highlight w:val="yellow"/>
               </w:rPr>
             </w:pPr>
             <w:r>
@@ -1460,7 +1429,6 @@
                 <w:spacing w:val="4"/>
                 <w:sz w:val="17"/>
                 <w:szCs w:val="17"/>
-                <w:highlight w:val="yellow"/>
               </w:rPr>
               <w:t xml:space="preserve">{initials}{/attendees}</w:t>
             </w:r>
@@ -1530,7 +1498,6 @@
           <w:bCs/>
           <w:sz w:val="19"/>
           <w:szCs w:val="19"/>
-          <w:highlight w:val="yellow"/>
         </w:rPr>
       </w:pPr>
       <w:r>
@@ -1538,7 +1505,6 @@
           <w:bCs/>
           <w:sz w:val="19"/>
           <w:szCs w:val="19"/>
-          <w:highlight w:val="yellow"/>
         </w:rPr>
         <w:t xml:space="preserve">{generalNotes}</w:t>
       </w:r>

</xml_diff>

<commit_message>
De-brand report template: dynamic file number and firm name, remove JLPa letterhead, fix file-number yellow highlight
</commit_message>
<xml_diff>
--- a/public/templates/note-visite-chantier.docx
+++ b/public/templates/note-visite-chantier.docx
@@ -2187,62 +2187,6 @@
       <w:rPr>
         <w:noProof/>
       </w:rPr>
-      <w:drawing>
-        <wp:anchor distT="0" distB="0" distL="114300" distR="114300" simplePos="0" relativeHeight="251661312" behindDoc="1" locked="0" layoutInCell="1" allowOverlap="1" wp14:anchorId="7D183996" wp14:editId="25663A30">
-          <wp:simplePos x="0" y="0"/>
-          <wp:positionH relativeFrom="page">
-            <wp:posOffset>4660900</wp:posOffset>
-          </wp:positionH>
-          <wp:positionV relativeFrom="page">
-            <wp:posOffset>8959850</wp:posOffset>
-          </wp:positionV>
-          <wp:extent cx="3111500" cy="1097280"/>
-          <wp:effectExtent l="0" t="0" r="0" b="0"/>
-          <wp:wrapNone/>
-          <wp:docPr id="13" name="Image 13"/>
-          <wp:cNvGraphicFramePr>
-            <a:graphicFrameLocks xmlns:a="http://schemas.openxmlformats.org/drawingml/2006/main" noChangeAspect="1"/>
-          </wp:cNvGraphicFramePr>
-          <a:graphic xmlns:a="http://schemas.openxmlformats.org/drawingml/2006/main">
-            <a:graphicData uri="http://schemas.openxmlformats.org/drawingml/2006/picture">
-              <pic:pic xmlns:pic="http://schemas.openxmlformats.org/drawingml/2006/picture">
-                <pic:nvPicPr>
-                  <pic:cNvPr id="4" name="Image 4"/>
-                  <pic:cNvPicPr/>
-                </pic:nvPicPr>
-                <pic:blipFill rotWithShape="1">
-                  <a:blip r:embed="rId1"/>
-                  <a:srcRect l="59967"/>
-                  <a:stretch/>
-                </pic:blipFill>
-                <pic:spPr bwMode="auto">
-                  <a:xfrm>
-                    <a:off x="0" y="0"/>
-                    <a:ext cx="3111500" cy="1097280"/>
-                  </a:xfrm>
-                  <a:prstGeom prst="rect">
-                    <a:avLst/>
-                  </a:prstGeom>
-                  <a:ln>
-                    <a:noFill/>
-                  </a:ln>
-                  <a:extLst>
-                    <a:ext uri="{53640926-AAD7-44D8-BBD7-CCE9431645EC}">
-                      <a14:shadowObscured xmlns:a14="http://schemas.microsoft.com/office/drawing/2010/main"/>
-                    </a:ext>
-                  </a:extLst>
-                </pic:spPr>
-              </pic:pic>
-            </a:graphicData>
-          </a:graphic>
-          <wp14:sizeRelH relativeFrom="margin">
-            <wp14:pctWidth>0</wp14:pctWidth>
-          </wp14:sizeRelH>
-          <wp14:sizeRelV relativeFrom="margin">
-            <wp14:pctHeight>0</wp14:pctHeight>
-          </wp14:sizeRelV>
-        </wp:anchor>
-      </w:drawing>
     </w:r>
   </w:p>
   <w:p>
@@ -2334,13 +2278,12 @@
         <w:sz w:val="16"/>
         <w:szCs w:val="16"/>
       </w:rPr>
-      <w:t xml:space="preserve">N° projet JLPa : </w:t>
+      <w:t xml:space="preserve">N° projet : </w:t>
     </w:r>
     <w:r>
       <w:rPr>
         <w:sz w:val="16"/>
         <w:szCs w:val="16"/>
-        <w:highlight w:val="yellow"/>
       </w:rPr>
       <w:t xml:space="preserve">{primaryDossierNumber}</w:t>
     </w:r>
@@ -2606,7 +2549,7 @@
               <w:sz w:val="17"/>
               <w:szCs w:val="17"/>
             </w:rPr>
-            <w:t xml:space="preserve">Jodoin Lamarre Pratte architectes </w:t>
+            <w:t>{firmName}</w:t>
           </w:r>
           <w:proofErr w:type="spellStart"/>
           <w:r>
@@ -2614,7 +2557,7 @@
               <w:sz w:val="17"/>
               <w:szCs w:val="17"/>
             </w:rPr>
-            <w:t>inc.</w:t>
+            <w:t xml:space="preserve"/>
           </w:r>
           <w:proofErr w:type="spellEnd"/>
         </w:p>
@@ -2739,55 +2682,6 @@
       <w:rPr>
         <w:noProof/>
       </w:rPr>
-      <w:drawing>
-        <wp:anchor distT="0" distB="0" distL="114300" distR="114300" simplePos="0" relativeHeight="251659264" behindDoc="1" locked="0" layoutInCell="1" allowOverlap="1" wp14:anchorId="19F6005F" wp14:editId="0D78F65D">
-          <wp:simplePos x="0" y="0"/>
-          <wp:positionH relativeFrom="page">
-            <wp:align>right</wp:align>
-          </wp:positionH>
-          <wp:positionV relativeFrom="page">
-            <wp:align>bottom</wp:align>
-          </wp:positionV>
-          <wp:extent cx="7772400" cy="1097280"/>
-          <wp:effectExtent l="0" t="0" r="0" b="0"/>
-          <wp:wrapNone/>
-          <wp:docPr id="4" name="Image 4"/>
-          <wp:cNvGraphicFramePr>
-            <a:graphicFrameLocks xmlns:a="http://schemas.openxmlformats.org/drawingml/2006/main" noChangeAspect="1"/>
-          </wp:cNvGraphicFramePr>
-          <a:graphic xmlns:a="http://schemas.openxmlformats.org/drawingml/2006/main">
-            <a:graphicData uri="http://schemas.openxmlformats.org/drawingml/2006/picture">
-              <pic:pic xmlns:pic="http://schemas.openxmlformats.org/drawingml/2006/picture">
-                <pic:nvPicPr>
-                  <pic:cNvPr id="4" name="Image 4"/>
-                  <pic:cNvPicPr/>
-                </pic:nvPicPr>
-                <pic:blipFill>
-                  <a:blip r:embed="rId2"/>
-                  <a:stretch>
-                    <a:fillRect/>
-                  </a:stretch>
-                </pic:blipFill>
-                <pic:spPr>
-                  <a:xfrm>
-                    <a:off x="0" y="0"/>
-                    <a:ext cx="7772400" cy="1097280"/>
-                  </a:xfrm>
-                  <a:prstGeom prst="rect">
-                    <a:avLst/>
-                  </a:prstGeom>
-                </pic:spPr>
-              </pic:pic>
-            </a:graphicData>
-          </a:graphic>
-          <wp14:sizeRelH relativeFrom="margin">
-            <wp14:pctWidth>0</wp14:pctWidth>
-          </wp14:sizeRelH>
-          <wp14:sizeRelV relativeFrom="margin">
-            <wp14:pctHeight>0</wp14:pctHeight>
-          </wp14:sizeRelV>
-        </wp:anchor>
-      </w:drawing>
     </w:r>
   </w:p>
   <w:p>

</xml_diff>

<commit_message>
Report: remove deficiencies section and Distribution; auto-fill Préparé par from account and Entrepreneur from project; simplify generator form (13→7 fields)
</commit_message>
<xml_diff>
--- a/public/templates/note-visite-chantier.docx
+++ b/public/templates/note-visite-chantier.docx
@@ -635,8 +635,8 @@
       <w:tr>
         <w:tc>
           <w:tcPr>
-            <w:tcW w:w="6480" w:type="dxa"/>
-            <w:gridSpan w:val="2"/>
+            <w:tcW w:w="9720" w:type="dxa"/>
+            <w:gridSpan w:val="3"/>
             <w:tcBorders>
               <w:top w:val="nil"/>
               <w:bottom w:val="single" w:sz="4" w:space="0" w:color="auto"/>
@@ -681,60 +681,12 @@
             </w:r>
           </w:p>
         </w:tc>
-        <w:tc>
-          <w:tcPr>
-            <w:tcW w:w="3240" w:type="dxa"/>
-            <w:tcBorders>
-              <w:top w:val="nil"/>
-              <w:bottom w:val="single" w:sz="4" w:space="0" w:color="auto"/>
-            </w:tcBorders>
-            <w:tcMar>
-              <w:top w:w="29" w:type="dxa"/>
-              <w:left w:w="0" w:type="dxa"/>
-              <w:bottom w:w="29" w:type="dxa"/>
-              <w:right w:w="0" w:type="dxa"/>
-            </w:tcMar>
-            <w:vAlign w:val="bottom"/>
-          </w:tcPr>
-          <w:p>
-            <w:pPr>
-              <w:spacing w:line="240" w:lineRule="auto"/>
-              <w:rPr>
-                <w:rFonts w:cs="Arial"/>
-                <w:b/>
-                <w:spacing w:val="4"/>
-                <w:sz w:val="16"/>
-                <w:szCs w:val="16"/>
-              </w:rPr>
-            </w:pPr>
-            <w:r>
-              <w:rPr>
-                <w:rFonts w:cs="Arial"/>
-                <w:b/>
-                <w:spacing w:val="4"/>
-                <w:sz w:val="16"/>
-                <w:szCs w:val="16"/>
-              </w:rPr>
-              <w:t>DISTRIBUTION</w:t>
-            </w:r>
-            <w:r>
-              <w:rPr>
-                <w:rFonts w:cs="Arial"/>
-                <w:b/>
-                <w:spacing w:val="4"/>
-                <w:sz w:val="16"/>
-                <w:szCs w:val="16"/>
-              </w:rPr>
-              <w:t> </w:t>
-            </w:r>
-          </w:p>
-        </w:tc>
       </w:tr>
       <w:tr>
         <w:tc>
           <w:tcPr>
-            <w:tcW w:w="6480" w:type="dxa"/>
-            <w:gridSpan w:val="2"/>
+            <w:tcW w:w="9720" w:type="dxa"/>
+            <w:gridSpan w:val="3"/>
             <w:tcBorders>
               <w:top w:val="single" w:sz="4" w:space="0" w:color="auto"/>
               <w:bottom w:val="nil"/>
@@ -861,61 +813,6 @@
               <w:spacing w:line="240" w:lineRule="auto"/>
               <w:rPr>
                 <w:rFonts w:cs="Arial"/>
-                <w:spacing w:val="4"/>
-                <w:sz w:val="17"/>
-                <w:szCs w:val="17"/>
-              </w:rPr>
-            </w:pPr>
-          </w:p>
-        </w:tc>
-        <w:tc>
-          <w:tcPr>
-            <w:tcW w:w="3240" w:type="dxa"/>
-            <w:tcBorders>
-              <w:top w:val="single" w:sz="4" w:space="0" w:color="auto"/>
-              <w:bottom w:val="nil"/>
-            </w:tcBorders>
-            <w:tcMar>
-              <w:top w:w="43" w:type="dxa"/>
-              <w:left w:w="0" w:type="dxa"/>
-              <w:right w:w="0" w:type="dxa"/>
-            </w:tcMar>
-          </w:tcPr>
-          <w:p>
-            <w:pPr>
-              <w:spacing w:line="240" w:lineRule="auto"/>
-              <w:rPr>
-                <w:rFonts w:cs="Arial"/>
-                <w:spacing w:val="4"/>
-                <w:sz w:val="17"/>
-                <w:szCs w:val="17"/>
-              </w:rPr>
-            </w:pPr>
-            <w:r>
-              <w:rPr>
-                <w:rFonts w:cs="Arial"/>
-                <w:spacing w:val="4"/>
-                <w:sz w:val="17"/>
-                <w:szCs w:val="17"/>
-              </w:rPr>
-              <w:t xml:space="preserve">{#distribution}☐ </w:t>
-            </w:r>
-            <w:r>
-              <w:rPr>
-                <w:rFonts w:cs="Arial"/>
-                <w:spacing w:val="4"/>
-                <w:sz w:val="17"/>
-                <w:szCs w:val="17"/>
-              </w:rPr>
-              <w:t xml:space="preserve">{name}, {company}{/distribution}</w:t>
-            </w:r>
-          </w:p>
-          <w:p>
-            <w:pPr>
-              <w:spacing w:line="240" w:lineRule="auto"/>
-              <w:rPr>
-                <w:rFonts w:cs="Arial"/>
-                <w:b/>
                 <w:spacing w:val="4"/>
                 <w:sz w:val="17"/>
                 <w:szCs w:val="17"/>

</xml_diff>

<commit_message>
Remove GÉNÉRALITÉS ET AVANCEMENT from report (strip stale page-break hint), make visit notes optional throughout
</commit_message>
<xml_diff>
--- a/public/templates/note-visite-chantier.docx
+++ b/public/templates/note-visite-chantier.docx
@@ -1357,7 +1357,7 @@
       <w:pPr>
         <w:spacing w:line="240" w:lineRule="auto"/>
         <w:rPr>
-          <w:b/>
+          <w:bCs/>
           <w:sz w:val="19"/>
           <w:szCs w:val="19"/>
         </w:rPr>
@@ -1368,60 +1368,6 @@
           <w:sz w:val="19"/>
           <w:szCs w:val="19"/>
         </w:rPr>
-        <w:t xml:space="preserve">GÉNÉRALITÉS ET AVANCEMENT </w:t>
-      </w:r>
-    </w:p>
-    <w:p>
-      <w:pPr>
-        <w:spacing w:line="240" w:lineRule="auto"/>
-        <w:rPr>
-          <w:bCs/>
-          <w:sz w:val="19"/>
-          <w:szCs w:val="19"/>
-        </w:rPr>
-      </w:pPr>
-    </w:p>
-    <w:p>
-      <w:pPr>
-        <w:pStyle w:val="Paragraphedeliste"/>
-        <w:numPr>
-          <w:ilvl w:val="1"/>
-          <w:numId w:val="1"/>
-        </w:numPr>
-        <w:spacing w:after="120" w:line="240" w:lineRule="auto"/>
-        <w:ind w:left="547" w:hanging="547"/>
-        <w:contextualSpacing w:val="0"/>
-        <w:rPr>
-          <w:bCs/>
-          <w:sz w:val="19"/>
-          <w:szCs w:val="19"/>
-        </w:rPr>
-      </w:pPr>
-      <w:r>
-        <w:rPr>
-          <w:bCs/>
-          <w:sz w:val="19"/>
-          <w:szCs w:val="19"/>
-        </w:rPr>
-        <w:t xml:space="preserve">{generalNotes}</w:t>
-      </w:r>
-    </w:p>
-    <w:p>
-      <w:pPr>
-        <w:spacing w:line="240" w:lineRule="auto"/>
-        <w:rPr>
-          <w:bCs/>
-          <w:sz w:val="19"/>
-          <w:szCs w:val="19"/>
-        </w:rPr>
-      </w:pPr>
-      <w:r>
-        <w:rPr>
-          <w:b/>
-          <w:sz w:val="19"/>
-          <w:szCs w:val="19"/>
-        </w:rPr>
-        <w:lastRenderedPageBreak/>
         <w:t>OBSERVATIONS ET ACTIONS</w:t>
       </w:r>
     </w:p>

</xml_diff>